<commit_message>
added images to raport 9
</commit_message>
<xml_diff>
--- a/Rapoarte/TP-9.docx
+++ b/Rapoarte/TP-9.docx
@@ -784,7 +784,13 @@
       <w:pPr>
         <w:spacing/>
         <w:ind w:right="0" w:firstLine="0" w:left="0"/>
-        <w:rPr/>
+        <w:rPr>
+          <w:rFonts w:ascii="Times New Roman" w:hAnsi="Times New Roman" w:eastAsia="Times New Roman" w:cs="Times New Roman"/>
+          <w:color w:val="000000"/>
+          <w:sz w:val="24"/>
+          <w:szCs w:val="24"/>
+          <w:highlight w:val="none"/>
+        </w:rPr>
       </w:pPr>
       <w:r>
         <w:rPr>
@@ -842,7 +848,124 @@
         </w:rPr>
         <w:t xml:space="preserve"> pentru eliminarea spațiilor inutile și a caracterelor de linie nouă, ignorând liniile goale și comentariile. În rezultat, am obținut o listă cu 14 căi SUID.</w:t>
       </w:r>
-      <w:r/>
+      <w:r>
+        <w:rPr>
+          <w:rFonts w:ascii="Times New Roman" w:hAnsi="Times New Roman" w:eastAsia="Times New Roman" w:cs="Times New Roman"/>
+          <w:sz w:val="24"/>
+        </w:rPr>
+      </w:r>
+    </w:p>
+    <w:p>
+      <w:pPr>
+        <w:spacing/>
+        <w:ind w:right="0" w:firstLine="0" w:left="0"/>
+        <w:rPr>
+          <w:rFonts w:ascii="Times New Roman" w:hAnsi="Times New Roman" w:eastAsia="Times New Roman" w:cs="Times New Roman"/>
+          <w:sz w:val="24"/>
+          <w:szCs w:val="24"/>
+        </w:rPr>
+      </w:pPr>
+      <w:r>
+        <w:rPr>
+          <w:rFonts w:ascii="Times New Roman" w:hAnsi="Times New Roman" w:eastAsia="Times New Roman" w:cs="Times New Roman"/>
+          <w:color w:val="000000"/>
+          <w:sz w:val="24"/>
+          <w:highlight w:val="none"/>
+        </w:rPr>
+      </w:r>
+      <w:r>
+        <mc:AlternateContent>
+          <mc:Choice Requires="wpg">
+            <w:drawing>
+              <wp:inline xmlns:wp="http://schemas.openxmlformats.org/drawingml/2006/wordprocessingDrawing" distT="0" distB="0" distL="0" distR="0">
+                <wp:extent cx="5943600" cy="1349192"/>
+                <wp:effectExtent l="0" t="0" r="0" b="0"/>
+                <wp:docPr id="1" name=""/>
+                <wp:cNvGraphicFramePr>
+                  <a:graphicFrameLocks xmlns:a="http://schemas.openxmlformats.org/drawingml/2006/main" noChangeAspect="1"/>
+                </wp:cNvGraphicFramePr>
+                <a:graphic xmlns:a="http://schemas.openxmlformats.org/drawingml/2006/main">
+                  <a:graphicData uri="http://schemas.openxmlformats.org/drawingml/2006/picture">
+                    <pic:pic xmlns:pic="http://schemas.openxmlformats.org/drawingml/2006/picture">
+                      <pic:nvPicPr>
+                        <pic:cNvPr id="1451386509" name=""/>
+                        <pic:cNvPicPr>
+                          <a:picLocks noChangeAspect="1"/>
+                        </pic:cNvPicPr>
+                        <pic:nvPr/>
+                      </pic:nvPicPr>
+                      <pic:blipFill rotWithShape="1">
+                        <a:blip r:embed="rId8"/>
+                        <a:stretch/>
+                      </pic:blipFill>
+                      <pic:spPr bwMode="auto">
+                        <a:xfrm>
+                          <a:off x="0" y="0"/>
+                          <a:ext cx="5943599" cy="1349191"/>
+                        </a:xfrm>
+                        <a:prstGeom prst="rect">
+                          <a:avLst/>
+                        </a:prstGeom>
+                      </pic:spPr>
+                    </pic:pic>
+                  </a:graphicData>
+                </a:graphic>
+              </wp:inline>
+            </w:drawing>
+          </mc:Choice>
+          <mc:Fallback>
+            <w:pict>
+              <v:shapetype id="_x0000_t75" coordsize="21600,21600" o:spt="75" o:preferrelative="t" path="m@4@5l@4@11@9@11@9@5xe" filled="f" stroked="f">
+                <v:stroke joinstyle="miter"/>
+                <v:formulas>
+                  <v:f eqn="if lineDrawn pixelLineWidth 0"/>
+                  <v:f eqn="sum @0 1 0"/>
+                  <v:f eqn="sum 0 0 @1"/>
+                  <v:f eqn="prod @2 1 2"/>
+                  <v:f eqn="prod @3 21600 pixelWidth"/>
+                  <v:f eqn="prod @3 21600 pixelHeight"/>
+                  <v:f eqn="sum @0 0 1"/>
+                  <v:f eqn="prod @6 1 2"/>
+                  <v:f eqn="prod @7 21600 pixelWidth"/>
+                  <v:f eqn="sum @8 21600 0"/>
+                  <v:f eqn="prod @7 21600 pixelHeight"/>
+                  <v:f eqn="sum @10 21600 0"/>
+                </v:formulas>
+                <v:path o:extrusionok="f" gradientshapeok="t" o:connecttype="rect"/>
+                <o:lock v:ext="edit" aspectratio="t"/>
+              </v:shapetype>
+              <v:shape id="_x0000_i0" o:spid="_x0000_s0" type="#_x0000_t75" style="width:468.00pt;height:106.24pt;mso-wrap-distance-left:0.00pt;mso-wrap-distance-top:0.00pt;mso-wrap-distance-right:0.00pt;mso-wrap-distance-bottom:0.00pt;z-index:1;" stroked="false">
+                <v:imagedata r:id="rId8" o:title=""/>
+                <o:lock v:ext="edit" rotation="t"/>
+              </v:shape>
+            </w:pict>
+          </mc:Fallback>
+        </mc:AlternateContent>
+      </w:r>
+      <w:r>
+        <w:rPr>
+          <w:rFonts w:ascii="Times New Roman" w:hAnsi="Times New Roman" w:eastAsia="Times New Roman" w:cs="Times New Roman"/>
+          <w:color w:val="000000"/>
+          <w:sz w:val="24"/>
+          <w:highlight w:val="none"/>
+        </w:rPr>
+      </w:r>
+      <w:r>
+        <w:rPr>
+          <w:rFonts w:ascii="Times New Roman" w:hAnsi="Times New Roman" w:eastAsia="Times New Roman" w:cs="Times New Roman"/>
+          <w:color w:val="000000"/>
+          <w:sz w:val="24"/>
+          <w:highlight w:val="none"/>
+        </w:rPr>
+      </w:r>
+      <w:r>
+        <w:rPr>
+          <w:rFonts w:ascii="Times New Roman" w:hAnsi="Times New Roman" w:eastAsia="Times New Roman" w:cs="Times New Roman"/>
+          <w:color w:val="000000"/>
+          <w:sz w:val="24"/>
+          <w:highlight w:val="none"/>
+        </w:rPr>
+      </w:r>
     </w:p>
     <w:p>
       <w:pPr>
@@ -866,7 +989,13 @@
       <w:pPr>
         <w:spacing/>
         <w:ind w:right="0" w:firstLine="0" w:left="0"/>
-        <w:rPr/>
+        <w:rPr>
+          <w:rFonts w:ascii="Times New Roman" w:hAnsi="Times New Roman" w:eastAsia="Times New Roman" w:cs="Times New Roman"/>
+          <w:color w:val="000000"/>
+          <w:sz w:val="24"/>
+          <w:szCs w:val="24"/>
+          <w:highlight w:val="none"/>
+        </w:rPr>
       </w:pPr>
       <w:r>
         <w:rPr>
@@ -924,7 +1053,124 @@
         </w:rPr>
         <w:t xml:space="preserve">) pentru eliminarea duplicatelor. Astfel, din cele 14 căi inițiale am obținut 13 nume distincte.</w:t>
       </w:r>
-      <w:r/>
+      <w:r>
+        <w:rPr>
+          <w:rFonts w:ascii="Times New Roman" w:hAnsi="Times New Roman" w:eastAsia="Times New Roman" w:cs="Times New Roman"/>
+          <w:sz w:val="24"/>
+        </w:rPr>
+      </w:r>
+    </w:p>
+    <w:p>
+      <w:pPr>
+        <w:spacing/>
+        <w:ind w:right="0" w:firstLine="0" w:left="0"/>
+        <w:rPr>
+          <w:rFonts w:ascii="Times New Roman" w:hAnsi="Times New Roman" w:eastAsia="Times New Roman" w:cs="Times New Roman"/>
+          <w:sz w:val="24"/>
+          <w:szCs w:val="24"/>
+        </w:rPr>
+      </w:pPr>
+      <w:r>
+        <w:rPr>
+          <w:rFonts w:ascii="Times New Roman" w:hAnsi="Times New Roman" w:eastAsia="Times New Roman" w:cs="Times New Roman"/>
+          <w:color w:val="000000"/>
+          <w:sz w:val="24"/>
+          <w:highlight w:val="none"/>
+        </w:rPr>
+      </w:r>
+      <w:r>
+        <mc:AlternateContent>
+          <mc:Choice Requires="wpg">
+            <w:drawing>
+              <wp:inline xmlns:wp="http://schemas.openxmlformats.org/drawingml/2006/wordprocessingDrawing" distT="0" distB="0" distL="0" distR="0">
+                <wp:extent cx="5943600" cy="1349192"/>
+                <wp:effectExtent l="0" t="0" r="0" b="0"/>
+                <wp:docPr id="2" name=""/>
+                <wp:cNvGraphicFramePr>
+                  <a:graphicFrameLocks xmlns:a="http://schemas.openxmlformats.org/drawingml/2006/main" noChangeAspect="1"/>
+                </wp:cNvGraphicFramePr>
+                <a:graphic xmlns:a="http://schemas.openxmlformats.org/drawingml/2006/main">
+                  <a:graphicData uri="http://schemas.openxmlformats.org/drawingml/2006/picture">
+                    <pic:pic xmlns:pic="http://schemas.openxmlformats.org/drawingml/2006/picture">
+                      <pic:nvPicPr>
+                        <pic:cNvPr id="1651159615" name=""/>
+                        <pic:cNvPicPr>
+                          <a:picLocks noChangeAspect="1"/>
+                        </pic:cNvPicPr>
+                        <pic:nvPr/>
+                      </pic:nvPicPr>
+                      <pic:blipFill rotWithShape="1">
+                        <a:blip r:embed="rId9"/>
+                        <a:stretch/>
+                      </pic:blipFill>
+                      <pic:spPr bwMode="auto">
+                        <a:xfrm>
+                          <a:off x="0" y="0"/>
+                          <a:ext cx="5943599" cy="1349191"/>
+                        </a:xfrm>
+                        <a:prstGeom prst="rect">
+                          <a:avLst/>
+                        </a:prstGeom>
+                      </pic:spPr>
+                    </pic:pic>
+                  </a:graphicData>
+                </a:graphic>
+              </wp:inline>
+            </w:drawing>
+          </mc:Choice>
+          <mc:Fallback>
+            <w:pict>
+              <v:shapetype id="_x0000_t75" coordsize="21600,21600" o:spt="75" o:preferrelative="t" path="m@4@5l@4@11@9@11@9@5xe" filled="f" stroked="f">
+                <v:stroke joinstyle="miter"/>
+                <v:formulas>
+                  <v:f eqn="if lineDrawn pixelLineWidth 0"/>
+                  <v:f eqn="sum @0 1 0"/>
+                  <v:f eqn="sum 0 0 @1"/>
+                  <v:f eqn="prod @2 1 2"/>
+                  <v:f eqn="prod @3 21600 pixelWidth"/>
+                  <v:f eqn="prod @3 21600 pixelHeight"/>
+                  <v:f eqn="sum @0 0 1"/>
+                  <v:f eqn="prod @6 1 2"/>
+                  <v:f eqn="prod @7 21600 pixelWidth"/>
+                  <v:f eqn="sum @8 21600 0"/>
+                  <v:f eqn="prod @7 21600 pixelHeight"/>
+                  <v:f eqn="sum @10 21600 0"/>
+                </v:formulas>
+                <v:path o:extrusionok="f" gradientshapeok="t" o:connecttype="rect"/>
+                <o:lock v:ext="edit" aspectratio="t"/>
+              </v:shapetype>
+              <v:shape id="_x0000_i1" o:spid="_x0000_s1" type="#_x0000_t75" style="width:468.00pt;height:106.24pt;mso-wrap-distance-left:0.00pt;mso-wrap-distance-top:0.00pt;mso-wrap-distance-right:0.00pt;mso-wrap-distance-bottom:0.00pt;z-index:1;" stroked="false">
+                <v:imagedata r:id="rId9" o:title=""/>
+                <o:lock v:ext="edit" rotation="t"/>
+              </v:shape>
+            </w:pict>
+          </mc:Fallback>
+        </mc:AlternateContent>
+      </w:r>
+      <w:r>
+        <w:rPr>
+          <w:rFonts w:ascii="Times New Roman" w:hAnsi="Times New Roman" w:eastAsia="Times New Roman" w:cs="Times New Roman"/>
+          <w:color w:val="000000"/>
+          <w:sz w:val="24"/>
+          <w:highlight w:val="none"/>
+        </w:rPr>
+      </w:r>
+      <w:r>
+        <w:rPr>
+          <w:rFonts w:ascii="Times New Roman" w:hAnsi="Times New Roman" w:eastAsia="Times New Roman" w:cs="Times New Roman"/>
+          <w:color w:val="000000"/>
+          <w:sz w:val="24"/>
+          <w:highlight w:val="none"/>
+        </w:rPr>
+      </w:r>
+      <w:r>
+        <w:rPr>
+          <w:rFonts w:ascii="Times New Roman" w:hAnsi="Times New Roman" w:eastAsia="Times New Roman" w:cs="Times New Roman"/>
+          <w:color w:val="000000"/>
+          <w:sz w:val="24"/>
+          <w:highlight w:val="none"/>
+        </w:rPr>
+      </w:r>
     </w:p>
     <w:p>
       <w:pPr>
@@ -948,7 +1194,13 @@
       <w:pPr>
         <w:spacing/>
         <w:ind w:right="0" w:firstLine="0" w:left="0"/>
-        <w:rPr/>
+        <w:rPr>
+          <w:rFonts w:ascii="Times New Roman" w:hAnsi="Times New Roman" w:eastAsia="Times New Roman" w:cs="Times New Roman"/>
+          <w:color w:val="000000"/>
+          <w:sz w:val="24"/>
+          <w:szCs w:val="24"/>
+          <w:highlight w:val="none"/>
+        </w:rPr>
       </w:pPr>
       <w:r>
         <w:rPr>
@@ -990,7 +1242,124 @@
         </w:rPr>
         <w:t xml:space="preserve">, care conține programe potențial periculoase. Rezultatele au fost păstrate într-o listă de dicționare. Au fost identificate 13 fișiere SUID, dintre care 4 cu risc mare.</w:t>
       </w:r>
-      <w:r/>
+      <w:r>
+        <w:rPr>
+          <w:rFonts w:ascii="Times New Roman" w:hAnsi="Times New Roman" w:eastAsia="Times New Roman" w:cs="Times New Roman"/>
+          <w:sz w:val="24"/>
+        </w:rPr>
+      </w:r>
+    </w:p>
+    <w:p>
+      <w:pPr>
+        <w:spacing/>
+        <w:ind w:right="0" w:firstLine="0" w:left="0"/>
+        <w:rPr>
+          <w:rFonts w:ascii="Times New Roman" w:hAnsi="Times New Roman" w:eastAsia="Times New Roman" w:cs="Times New Roman"/>
+          <w:sz w:val="24"/>
+          <w:szCs w:val="24"/>
+        </w:rPr>
+      </w:pPr>
+      <w:r>
+        <w:rPr>
+          <w:rFonts w:ascii="Times New Roman" w:hAnsi="Times New Roman" w:eastAsia="Times New Roman" w:cs="Times New Roman"/>
+          <w:color w:val="000000"/>
+          <w:sz w:val="24"/>
+          <w:highlight w:val="none"/>
+        </w:rPr>
+      </w:r>
+      <w:r>
+        <mc:AlternateContent>
+          <mc:Choice Requires="wpg">
+            <w:drawing>
+              <wp:inline xmlns:wp="http://schemas.openxmlformats.org/drawingml/2006/wordprocessingDrawing" distT="0" distB="0" distL="0" distR="0">
+                <wp:extent cx="5943600" cy="5405548"/>
+                <wp:effectExtent l="0" t="0" r="0" b="0"/>
+                <wp:docPr id="3" name=""/>
+                <wp:cNvGraphicFramePr>
+                  <a:graphicFrameLocks xmlns:a="http://schemas.openxmlformats.org/drawingml/2006/main" noChangeAspect="1"/>
+                </wp:cNvGraphicFramePr>
+                <a:graphic xmlns:a="http://schemas.openxmlformats.org/drawingml/2006/main">
+                  <a:graphicData uri="http://schemas.openxmlformats.org/drawingml/2006/picture">
+                    <pic:pic xmlns:pic="http://schemas.openxmlformats.org/drawingml/2006/picture">
+                      <pic:nvPicPr>
+                        <pic:cNvPr id="1131602593" name=""/>
+                        <pic:cNvPicPr>
+                          <a:picLocks noChangeAspect="1"/>
+                        </pic:cNvPicPr>
+                        <pic:nvPr/>
+                      </pic:nvPicPr>
+                      <pic:blipFill rotWithShape="1">
+                        <a:blip r:embed="rId10"/>
+                        <a:stretch/>
+                      </pic:blipFill>
+                      <pic:spPr bwMode="auto">
+                        <a:xfrm>
+                          <a:off x="0" y="0"/>
+                          <a:ext cx="5943599" cy="5405547"/>
+                        </a:xfrm>
+                        <a:prstGeom prst="rect">
+                          <a:avLst/>
+                        </a:prstGeom>
+                      </pic:spPr>
+                    </pic:pic>
+                  </a:graphicData>
+                </a:graphic>
+              </wp:inline>
+            </w:drawing>
+          </mc:Choice>
+          <mc:Fallback>
+            <w:pict>
+              <v:shapetype id="_x0000_t75" coordsize="21600,21600" o:spt="75" o:preferrelative="t" path="m@4@5l@4@11@9@11@9@5xe" filled="f" stroked="f">
+                <v:stroke joinstyle="miter"/>
+                <v:formulas>
+                  <v:f eqn="if lineDrawn pixelLineWidth 0"/>
+                  <v:f eqn="sum @0 1 0"/>
+                  <v:f eqn="sum 0 0 @1"/>
+                  <v:f eqn="prod @2 1 2"/>
+                  <v:f eqn="prod @3 21600 pixelWidth"/>
+                  <v:f eqn="prod @3 21600 pixelHeight"/>
+                  <v:f eqn="sum @0 0 1"/>
+                  <v:f eqn="prod @6 1 2"/>
+                  <v:f eqn="prod @7 21600 pixelWidth"/>
+                  <v:f eqn="sum @8 21600 0"/>
+                  <v:f eqn="prod @7 21600 pixelHeight"/>
+                  <v:f eqn="sum @10 21600 0"/>
+                </v:formulas>
+                <v:path o:extrusionok="f" gradientshapeok="t" o:connecttype="rect"/>
+                <o:lock v:ext="edit" aspectratio="t"/>
+              </v:shapetype>
+              <v:shape id="_x0000_i2" o:spid="_x0000_s2" type="#_x0000_t75" style="width:468.00pt;height:425.63pt;mso-wrap-distance-left:0.00pt;mso-wrap-distance-top:0.00pt;mso-wrap-distance-right:0.00pt;mso-wrap-distance-bottom:0.00pt;z-index:1;" stroked="false">
+                <v:imagedata r:id="rId10" o:title=""/>
+                <o:lock v:ext="edit" rotation="t"/>
+              </v:shape>
+            </w:pict>
+          </mc:Fallback>
+        </mc:AlternateContent>
+      </w:r>
+      <w:r>
+        <w:rPr>
+          <w:rFonts w:ascii="Times New Roman" w:hAnsi="Times New Roman" w:eastAsia="Times New Roman" w:cs="Times New Roman"/>
+          <w:color w:val="000000"/>
+          <w:sz w:val="24"/>
+          <w:highlight w:val="none"/>
+        </w:rPr>
+      </w:r>
+      <w:r>
+        <w:rPr>
+          <w:rFonts w:ascii="Times New Roman" w:hAnsi="Times New Roman" w:eastAsia="Times New Roman" w:cs="Times New Roman"/>
+          <w:color w:val="000000"/>
+          <w:sz w:val="24"/>
+          <w:highlight w:val="none"/>
+        </w:rPr>
+      </w:r>
+      <w:r>
+        <w:rPr>
+          <w:rFonts w:ascii="Times New Roman" w:hAnsi="Times New Roman" w:eastAsia="Times New Roman" w:cs="Times New Roman"/>
+          <w:color w:val="000000"/>
+          <w:sz w:val="24"/>
+          <w:highlight w:val="none"/>
+        </w:rPr>
+      </w:r>
     </w:p>
     <w:p>
       <w:pPr>
@@ -1014,7 +1383,13 @@
       <w:pPr>
         <w:spacing/>
         <w:ind w:right="0" w:firstLine="0" w:left="0"/>
-        <w:rPr/>
+        <w:rPr>
+          <w:rFonts w:ascii="Times New Roman" w:hAnsi="Times New Roman" w:eastAsia="Times New Roman" w:cs="Times New Roman"/>
+          <w:color w:val="000000"/>
+          <w:sz w:val="24"/>
+          <w:szCs w:val="24"/>
+          <w:highlight w:val="none"/>
+        </w:rPr>
       </w:pPr>
       <w:r>
         <w:rPr>
@@ -1088,7 +1463,237 @@
         </w:rPr>
         <w:t xml:space="preserve"> am grupat toate constatările în trei categorii: SUID, sudo și cron.</w:t>
       </w:r>
-      <w:r/>
+      <w:r>
+        <w:rPr>
+          <w:rFonts w:ascii="Times New Roman" w:hAnsi="Times New Roman" w:eastAsia="Times New Roman" w:cs="Times New Roman"/>
+          <w:sz w:val="24"/>
+        </w:rPr>
+      </w:r>
+    </w:p>
+    <w:p>
+      <w:pPr>
+        <w:spacing/>
+        <w:ind w:right="0" w:firstLine="0" w:left="0"/>
+        <w:rPr>
+          <w:rFonts w:ascii="Times New Roman" w:hAnsi="Times New Roman" w:eastAsia="Times New Roman" w:cs="Times New Roman"/>
+          <w:color w:val="000000"/>
+          <w:sz w:val="24"/>
+          <w:szCs w:val="24"/>
+          <w:highlight w:val="none"/>
+        </w:rPr>
+      </w:pPr>
+      <w:r>
+        <w:rPr>
+          <w:rFonts w:ascii="Times New Roman" w:hAnsi="Times New Roman" w:eastAsia="Times New Roman" w:cs="Times New Roman"/>
+          <w:color w:val="000000"/>
+          <w:sz w:val="24"/>
+          <w:highlight w:val="none"/>
+        </w:rPr>
+      </w:r>
+      <w:r>
+        <w:rPr>
+          <w:rFonts w:ascii="Times New Roman" w:hAnsi="Times New Roman" w:eastAsia="Times New Roman" w:cs="Times New Roman"/>
+          <w:color w:val="000000"/>
+          <w:sz w:val="24"/>
+          <w:highlight w:val="none"/>
+        </w:rPr>
+      </w:r>
+      <w:r>
+        <mc:AlternateContent>
+          <mc:Choice Requires="wpg">
+            <w:drawing>
+              <wp:inline xmlns:wp="http://schemas.openxmlformats.org/drawingml/2006/wordprocessingDrawing" distT="0" distB="0" distL="0" distR="0">
+                <wp:extent cx="5943600" cy="4871803"/>
+                <wp:effectExtent l="0" t="0" r="0" b="0"/>
+                <wp:docPr id="4" name=""/>
+                <wp:cNvGraphicFramePr>
+                  <a:graphicFrameLocks xmlns:a="http://schemas.openxmlformats.org/drawingml/2006/main" noChangeAspect="1"/>
+                </wp:cNvGraphicFramePr>
+                <a:graphic xmlns:a="http://schemas.openxmlformats.org/drawingml/2006/main">
+                  <a:graphicData uri="http://schemas.openxmlformats.org/drawingml/2006/picture">
+                    <pic:pic xmlns:pic="http://schemas.openxmlformats.org/drawingml/2006/picture">
+                      <pic:nvPicPr>
+                        <pic:cNvPr id="689188501" name=""/>
+                        <pic:cNvPicPr>
+                          <a:picLocks noChangeAspect="1"/>
+                        </pic:cNvPicPr>
+                        <pic:nvPr/>
+                      </pic:nvPicPr>
+                      <pic:blipFill rotWithShape="1">
+                        <a:blip r:embed="rId11"/>
+                        <a:stretch/>
+                      </pic:blipFill>
+                      <pic:spPr bwMode="auto">
+                        <a:xfrm>
+                          <a:off x="0" y="0"/>
+                          <a:ext cx="5943599" cy="4871802"/>
+                        </a:xfrm>
+                        <a:prstGeom prst="rect">
+                          <a:avLst/>
+                        </a:prstGeom>
+                      </pic:spPr>
+                    </pic:pic>
+                  </a:graphicData>
+                </a:graphic>
+              </wp:inline>
+            </w:drawing>
+          </mc:Choice>
+          <mc:Fallback>
+            <w:pict>
+              <v:shapetype id="_x0000_t75" coordsize="21600,21600" o:spt="75" o:preferrelative="t" path="m@4@5l@4@11@9@11@9@5xe" filled="f" stroked="f">
+                <v:stroke joinstyle="miter"/>
+                <v:formulas>
+                  <v:f eqn="if lineDrawn pixelLineWidth 0"/>
+                  <v:f eqn="sum @0 1 0"/>
+                  <v:f eqn="sum 0 0 @1"/>
+                  <v:f eqn="prod @2 1 2"/>
+                  <v:f eqn="prod @3 21600 pixelWidth"/>
+                  <v:f eqn="prod @3 21600 pixelHeight"/>
+                  <v:f eqn="sum @0 0 1"/>
+                  <v:f eqn="prod @6 1 2"/>
+                  <v:f eqn="prod @7 21600 pixelWidth"/>
+                  <v:f eqn="sum @8 21600 0"/>
+                  <v:f eqn="prod @7 21600 pixelHeight"/>
+                  <v:f eqn="sum @10 21600 0"/>
+                </v:formulas>
+                <v:path o:extrusionok="f" gradientshapeok="t" o:connecttype="rect"/>
+                <o:lock v:ext="edit" aspectratio="t"/>
+              </v:shapetype>
+              <v:shape id="_x0000_i3" o:spid="_x0000_s3" type="#_x0000_t75" style="width:468.00pt;height:383.61pt;mso-wrap-distance-left:0.00pt;mso-wrap-distance-top:0.00pt;mso-wrap-distance-right:0.00pt;mso-wrap-distance-bottom:0.00pt;z-index:1;" stroked="false">
+                <v:imagedata r:id="rId11" o:title=""/>
+                <o:lock v:ext="edit" rotation="t"/>
+              </v:shape>
+            </w:pict>
+          </mc:Fallback>
+        </mc:AlternateContent>
+      </w:r>
+      <w:r>
+        <w:rPr>
+          <w:rFonts w:ascii="Times New Roman" w:hAnsi="Times New Roman" w:eastAsia="Times New Roman" w:cs="Times New Roman"/>
+          <w:color w:val="000000"/>
+          <w:sz w:val="24"/>
+          <w:highlight w:val="none"/>
+        </w:rPr>
+      </w:r>
+      <w:r>
+        <w:rPr>
+          <w:rFonts w:ascii="Times New Roman" w:hAnsi="Times New Roman" w:eastAsia="Times New Roman" w:cs="Times New Roman"/>
+          <w:sz w:val="24"/>
+          <w:szCs w:val="24"/>
+        </w:rPr>
+      </w:r>
+    </w:p>
+    <w:p>
+      <w:pPr>
+        <w:spacing/>
+        <w:ind w:right="0" w:firstLine="0" w:left="0"/>
+        <w:rPr>
+          <w:rFonts w:ascii="Times New Roman" w:hAnsi="Times New Roman" w:eastAsia="Times New Roman" w:cs="Times New Roman"/>
+          <w:sz w:val="24"/>
+          <w:szCs w:val="24"/>
+        </w:rPr>
+      </w:pPr>
+      <w:r>
+        <w:rPr>
+          <w:rFonts w:ascii="Times New Roman" w:hAnsi="Times New Roman" w:eastAsia="Times New Roman" w:cs="Times New Roman"/>
+          <w:color w:val="000000"/>
+          <w:sz w:val="24"/>
+          <w:highlight w:val="none"/>
+        </w:rPr>
+      </w:r>
+      <w:r>
+        <mc:AlternateContent>
+          <mc:Choice Requires="wpg">
+            <w:drawing>
+              <wp:inline xmlns:wp="http://schemas.openxmlformats.org/drawingml/2006/wordprocessingDrawing" distT="0" distB="0" distL="0" distR="0">
+                <wp:extent cx="5943600" cy="1222299"/>
+                <wp:effectExtent l="0" t="0" r="0" b="0"/>
+                <wp:docPr id="5" name=""/>
+                <wp:cNvGraphicFramePr>
+                  <a:graphicFrameLocks xmlns:a="http://schemas.openxmlformats.org/drawingml/2006/main" noChangeAspect="1"/>
+                </wp:cNvGraphicFramePr>
+                <a:graphic xmlns:a="http://schemas.openxmlformats.org/drawingml/2006/main">
+                  <a:graphicData uri="http://schemas.openxmlformats.org/drawingml/2006/picture">
+                    <pic:pic xmlns:pic="http://schemas.openxmlformats.org/drawingml/2006/picture">
+                      <pic:nvPicPr>
+                        <pic:cNvPr id="1015363057" name=""/>
+                        <pic:cNvPicPr>
+                          <a:picLocks noChangeAspect="1"/>
+                        </pic:cNvPicPr>
+                        <pic:nvPr/>
+                      </pic:nvPicPr>
+                      <pic:blipFill rotWithShape="1">
+                        <a:blip r:embed="rId12"/>
+                        <a:stretch/>
+                      </pic:blipFill>
+                      <pic:spPr bwMode="auto">
+                        <a:xfrm>
+                          <a:off x="0" y="0"/>
+                          <a:ext cx="5943599" cy="1222299"/>
+                        </a:xfrm>
+                        <a:prstGeom prst="rect">
+                          <a:avLst/>
+                        </a:prstGeom>
+                      </pic:spPr>
+                    </pic:pic>
+                  </a:graphicData>
+                </a:graphic>
+              </wp:inline>
+            </w:drawing>
+          </mc:Choice>
+          <mc:Fallback>
+            <w:pict>
+              <v:shapetype id="_x0000_t75" coordsize="21600,21600" o:spt="75" o:preferrelative="t" path="m@4@5l@4@11@9@11@9@5xe" filled="f" stroked="f">
+                <v:stroke joinstyle="miter"/>
+                <v:formulas>
+                  <v:f eqn="if lineDrawn pixelLineWidth 0"/>
+                  <v:f eqn="sum @0 1 0"/>
+                  <v:f eqn="sum 0 0 @1"/>
+                  <v:f eqn="prod @2 1 2"/>
+                  <v:f eqn="prod @3 21600 pixelWidth"/>
+                  <v:f eqn="prod @3 21600 pixelHeight"/>
+                  <v:f eqn="sum @0 0 1"/>
+                  <v:f eqn="prod @6 1 2"/>
+                  <v:f eqn="prod @7 21600 pixelWidth"/>
+                  <v:f eqn="sum @8 21600 0"/>
+                  <v:f eqn="prod @7 21600 pixelHeight"/>
+                  <v:f eqn="sum @10 21600 0"/>
+                </v:formulas>
+                <v:path o:extrusionok="f" gradientshapeok="t" o:connecttype="rect"/>
+                <o:lock v:ext="edit" aspectratio="t"/>
+              </v:shapetype>
+              <v:shape id="_x0000_i4" o:spid="_x0000_s4" type="#_x0000_t75" style="width:468.00pt;height:96.24pt;mso-wrap-distance-left:0.00pt;mso-wrap-distance-top:0.00pt;mso-wrap-distance-right:0.00pt;mso-wrap-distance-bottom:0.00pt;z-index:1;" stroked="false">
+                <v:imagedata r:id="rId12" o:title=""/>
+                <o:lock v:ext="edit" rotation="t"/>
+              </v:shape>
+            </w:pict>
+          </mc:Fallback>
+        </mc:AlternateContent>
+      </w:r>
+      <w:r>
+        <w:rPr>
+          <w:rFonts w:ascii="Times New Roman" w:hAnsi="Times New Roman" w:eastAsia="Times New Roman" w:cs="Times New Roman"/>
+          <w:color w:val="000000"/>
+          <w:sz w:val="24"/>
+          <w:highlight w:val="none"/>
+        </w:rPr>
+      </w:r>
+      <w:r>
+        <w:rPr>
+          <w:rFonts w:ascii="Times New Roman" w:hAnsi="Times New Roman" w:eastAsia="Times New Roman" w:cs="Times New Roman"/>
+          <w:color w:val="000000"/>
+          <w:sz w:val="24"/>
+          <w:highlight w:val="none"/>
+        </w:rPr>
+      </w:r>
+      <w:r>
+        <w:rPr>
+          <w:rFonts w:ascii="Times New Roman" w:hAnsi="Times New Roman" w:eastAsia="Times New Roman" w:cs="Times New Roman"/>
+          <w:color w:val="000000"/>
+          <w:sz w:val="24"/>
+          <w:highlight w:val="none"/>
+        </w:rPr>
+      </w:r>
     </w:p>
     <w:p>
       <w:pPr>
@@ -1112,7 +1717,13 @@
       <w:pPr>
         <w:spacing/>
         <w:ind w:right="0" w:firstLine="0" w:left="0"/>
-        <w:rPr/>
+        <w:rPr>
+          <w:rFonts w:ascii="Times New Roman" w:hAnsi="Times New Roman" w:eastAsia="Times New Roman" w:cs="Times New Roman"/>
+          <w:color w:val="000000"/>
+          <w:sz w:val="24"/>
+          <w:szCs w:val="24"/>
+          <w:highlight w:val="none"/>
+        </w:rPr>
       </w:pPr>
       <w:r>
         <w:rPr>
@@ -1186,7 +1797,124 @@
         </w:rPr>
         <w:t xml:space="preserve">. De asemenea, am identificat utilizatorii implicați, eliminând duplicatele cu ajutorul mulțimilor.</w:t>
       </w:r>
-      <w:r/>
+      <w:r>
+        <w:rPr>
+          <w:rFonts w:ascii="Times New Roman" w:hAnsi="Times New Roman" w:eastAsia="Times New Roman" w:cs="Times New Roman"/>
+          <w:sz w:val="24"/>
+        </w:rPr>
+      </w:r>
+    </w:p>
+    <w:p>
+      <w:pPr>
+        <w:spacing/>
+        <w:ind w:right="0" w:firstLine="0" w:left="0"/>
+        <w:rPr>
+          <w:rFonts w:ascii="Times New Roman" w:hAnsi="Times New Roman" w:eastAsia="Times New Roman" w:cs="Times New Roman"/>
+          <w:sz w:val="24"/>
+          <w:szCs w:val="24"/>
+        </w:rPr>
+      </w:pPr>
+      <w:r>
+        <w:rPr>
+          <w:rFonts w:ascii="Times New Roman" w:hAnsi="Times New Roman" w:eastAsia="Times New Roman" w:cs="Times New Roman"/>
+          <w:color w:val="000000"/>
+          <w:sz w:val="24"/>
+          <w:highlight w:val="none"/>
+        </w:rPr>
+      </w:r>
+      <w:r>
+        <mc:AlternateContent>
+          <mc:Choice Requires="wpg">
+            <w:drawing>
+              <wp:inline xmlns:wp="http://schemas.openxmlformats.org/drawingml/2006/wordprocessingDrawing" distT="0" distB="0" distL="0" distR="0">
+                <wp:extent cx="5943600" cy="4335786"/>
+                <wp:effectExtent l="0" t="0" r="0" b="0"/>
+                <wp:docPr id="6" name=""/>
+                <wp:cNvGraphicFramePr>
+                  <a:graphicFrameLocks xmlns:a="http://schemas.openxmlformats.org/drawingml/2006/main" noChangeAspect="1"/>
+                </wp:cNvGraphicFramePr>
+                <a:graphic xmlns:a="http://schemas.openxmlformats.org/drawingml/2006/main">
+                  <a:graphicData uri="http://schemas.openxmlformats.org/drawingml/2006/picture">
+                    <pic:pic xmlns:pic="http://schemas.openxmlformats.org/drawingml/2006/picture">
+                      <pic:nvPicPr>
+                        <pic:cNvPr id="1317089105" name=""/>
+                        <pic:cNvPicPr>
+                          <a:picLocks noChangeAspect="1"/>
+                        </pic:cNvPicPr>
+                        <pic:nvPr/>
+                      </pic:nvPicPr>
+                      <pic:blipFill rotWithShape="1">
+                        <a:blip r:embed="rId13"/>
+                        <a:stretch/>
+                      </pic:blipFill>
+                      <pic:spPr bwMode="auto">
+                        <a:xfrm>
+                          <a:off x="0" y="0"/>
+                          <a:ext cx="5943599" cy="4335786"/>
+                        </a:xfrm>
+                        <a:prstGeom prst="rect">
+                          <a:avLst/>
+                        </a:prstGeom>
+                      </pic:spPr>
+                    </pic:pic>
+                  </a:graphicData>
+                </a:graphic>
+              </wp:inline>
+            </w:drawing>
+          </mc:Choice>
+          <mc:Fallback>
+            <w:pict>
+              <v:shapetype id="_x0000_t75" coordsize="21600,21600" o:spt="75" o:preferrelative="t" path="m@4@5l@4@11@9@11@9@5xe" filled="f" stroked="f">
+                <v:stroke joinstyle="miter"/>
+                <v:formulas>
+                  <v:f eqn="if lineDrawn pixelLineWidth 0"/>
+                  <v:f eqn="sum @0 1 0"/>
+                  <v:f eqn="sum 0 0 @1"/>
+                  <v:f eqn="prod @2 1 2"/>
+                  <v:f eqn="prod @3 21600 pixelWidth"/>
+                  <v:f eqn="prod @3 21600 pixelHeight"/>
+                  <v:f eqn="sum @0 0 1"/>
+                  <v:f eqn="prod @6 1 2"/>
+                  <v:f eqn="prod @7 21600 pixelWidth"/>
+                  <v:f eqn="sum @8 21600 0"/>
+                  <v:f eqn="prod @7 21600 pixelHeight"/>
+                  <v:f eqn="sum @10 21600 0"/>
+                </v:formulas>
+                <v:path o:extrusionok="f" gradientshapeok="t" o:connecttype="rect"/>
+                <o:lock v:ext="edit" aspectratio="t"/>
+              </v:shapetype>
+              <v:shape id="_x0000_i5" o:spid="_x0000_s5" type="#_x0000_t75" style="width:468.00pt;height:341.40pt;mso-wrap-distance-left:0.00pt;mso-wrap-distance-top:0.00pt;mso-wrap-distance-right:0.00pt;mso-wrap-distance-bottom:0.00pt;z-index:1;" stroked="false">
+                <v:imagedata r:id="rId13" o:title=""/>
+                <o:lock v:ext="edit" rotation="t"/>
+              </v:shape>
+            </w:pict>
+          </mc:Fallback>
+        </mc:AlternateContent>
+      </w:r>
+      <w:r>
+        <w:rPr>
+          <w:rFonts w:ascii="Times New Roman" w:hAnsi="Times New Roman" w:eastAsia="Times New Roman" w:cs="Times New Roman"/>
+          <w:color w:val="000000"/>
+          <w:sz w:val="24"/>
+          <w:highlight w:val="none"/>
+        </w:rPr>
+      </w:r>
+      <w:r>
+        <w:rPr>
+          <w:rFonts w:ascii="Times New Roman" w:hAnsi="Times New Roman" w:eastAsia="Times New Roman" w:cs="Times New Roman"/>
+          <w:color w:val="000000"/>
+          <w:sz w:val="24"/>
+          <w:highlight w:val="none"/>
+        </w:rPr>
+      </w:r>
+      <w:r>
+        <w:rPr>
+          <w:rFonts w:ascii="Times New Roman" w:hAnsi="Times New Roman" w:eastAsia="Times New Roman" w:cs="Times New Roman"/>
+          <w:color w:val="000000"/>
+          <w:sz w:val="24"/>
+          <w:highlight w:val="none"/>
+        </w:rPr>
+      </w:r>
     </w:p>
     <w:p>
       <w:pPr>
@@ -1228,7 +1956,13 @@
       <w:pPr>
         <w:spacing/>
         <w:ind w:right="0" w:firstLine="0" w:left="0"/>
-        <w:rPr/>
+        <w:rPr>
+          <w:rFonts w:ascii="Times New Roman" w:hAnsi="Times New Roman" w:eastAsia="Times New Roman" w:cs="Times New Roman"/>
+          <w:color w:val="000000"/>
+          <w:sz w:val="24"/>
+          <w:szCs w:val="24"/>
+          <w:highlight w:val="none"/>
+        </w:rPr>
       </w:pPr>
       <w:r>
         <w:rPr>
@@ -1270,7 +2004,124 @@
         </w:rPr>
         <w:t xml:space="preserve">, care citește căile fișierelor și le transformă într-o mulțime. Am comparat două fișiere, unul reprezentând sistemul curat și celălalt starea actuală. Am obținut 9 căi distincte în sistemul de bază și 13 în cel actual.</w:t>
       </w:r>
-      <w:r/>
+      <w:r>
+        <w:rPr>
+          <w:rFonts w:ascii="Times New Roman" w:hAnsi="Times New Roman" w:eastAsia="Times New Roman" w:cs="Times New Roman"/>
+          <w:sz w:val="24"/>
+        </w:rPr>
+      </w:r>
+    </w:p>
+    <w:p>
+      <w:pPr>
+        <w:spacing/>
+        <w:ind w:right="0" w:firstLine="0" w:left="0"/>
+        <w:rPr>
+          <w:rFonts w:ascii="Times New Roman" w:hAnsi="Times New Roman" w:eastAsia="Times New Roman" w:cs="Times New Roman"/>
+          <w:sz w:val="24"/>
+          <w:szCs w:val="24"/>
+        </w:rPr>
+      </w:pPr>
+      <w:r>
+        <w:rPr>
+          <w:rFonts w:ascii="Times New Roman" w:hAnsi="Times New Roman" w:eastAsia="Times New Roman" w:cs="Times New Roman"/>
+          <w:color w:val="000000"/>
+          <w:sz w:val="24"/>
+          <w:highlight w:val="none"/>
+        </w:rPr>
+      </w:r>
+      <w:r>
+        <mc:AlternateContent>
+          <mc:Choice Requires="wpg">
+            <w:drawing>
+              <wp:inline xmlns:wp="http://schemas.openxmlformats.org/drawingml/2006/wordprocessingDrawing" distT="0" distB="0" distL="0" distR="0">
+                <wp:extent cx="5943600" cy="1730722"/>
+                <wp:effectExtent l="0" t="0" r="0" b="0"/>
+                <wp:docPr id="7" name=""/>
+                <wp:cNvGraphicFramePr>
+                  <a:graphicFrameLocks xmlns:a="http://schemas.openxmlformats.org/drawingml/2006/main" noChangeAspect="1"/>
+                </wp:cNvGraphicFramePr>
+                <a:graphic xmlns:a="http://schemas.openxmlformats.org/drawingml/2006/main">
+                  <a:graphicData uri="http://schemas.openxmlformats.org/drawingml/2006/picture">
+                    <pic:pic xmlns:pic="http://schemas.openxmlformats.org/drawingml/2006/picture">
+                      <pic:nvPicPr>
+                        <pic:cNvPr id="1336747662" name=""/>
+                        <pic:cNvPicPr>
+                          <a:picLocks noChangeAspect="1"/>
+                        </pic:cNvPicPr>
+                        <pic:nvPr/>
+                      </pic:nvPicPr>
+                      <pic:blipFill rotWithShape="1">
+                        <a:blip r:embed="rId14"/>
+                        <a:stretch/>
+                      </pic:blipFill>
+                      <pic:spPr bwMode="auto">
+                        <a:xfrm>
+                          <a:off x="0" y="0"/>
+                          <a:ext cx="5943599" cy="1730721"/>
+                        </a:xfrm>
+                        <a:prstGeom prst="rect">
+                          <a:avLst/>
+                        </a:prstGeom>
+                      </pic:spPr>
+                    </pic:pic>
+                  </a:graphicData>
+                </a:graphic>
+              </wp:inline>
+            </w:drawing>
+          </mc:Choice>
+          <mc:Fallback>
+            <w:pict>
+              <v:shapetype id="_x0000_t75" coordsize="21600,21600" o:spt="75" o:preferrelative="t" path="m@4@5l@4@11@9@11@9@5xe" filled="f" stroked="f">
+                <v:stroke joinstyle="miter"/>
+                <v:formulas>
+                  <v:f eqn="if lineDrawn pixelLineWidth 0"/>
+                  <v:f eqn="sum @0 1 0"/>
+                  <v:f eqn="sum 0 0 @1"/>
+                  <v:f eqn="prod @2 1 2"/>
+                  <v:f eqn="prod @3 21600 pixelWidth"/>
+                  <v:f eqn="prod @3 21600 pixelHeight"/>
+                  <v:f eqn="sum @0 0 1"/>
+                  <v:f eqn="prod @6 1 2"/>
+                  <v:f eqn="prod @7 21600 pixelWidth"/>
+                  <v:f eqn="sum @8 21600 0"/>
+                  <v:f eqn="prod @7 21600 pixelHeight"/>
+                  <v:f eqn="sum @10 21600 0"/>
+                </v:formulas>
+                <v:path o:extrusionok="f" gradientshapeok="t" o:connecttype="rect"/>
+                <o:lock v:ext="edit" aspectratio="t"/>
+              </v:shapetype>
+              <v:shape id="_x0000_i6" o:spid="_x0000_s6" type="#_x0000_t75" style="width:468.00pt;height:136.28pt;mso-wrap-distance-left:0.00pt;mso-wrap-distance-top:0.00pt;mso-wrap-distance-right:0.00pt;mso-wrap-distance-bottom:0.00pt;z-index:1;" stroked="false">
+                <v:imagedata r:id="rId14" o:title=""/>
+                <o:lock v:ext="edit" rotation="t"/>
+              </v:shape>
+            </w:pict>
+          </mc:Fallback>
+        </mc:AlternateContent>
+      </w:r>
+      <w:r>
+        <w:rPr>
+          <w:rFonts w:ascii="Times New Roman" w:hAnsi="Times New Roman" w:eastAsia="Times New Roman" w:cs="Times New Roman"/>
+          <w:color w:val="000000"/>
+          <w:sz w:val="24"/>
+          <w:highlight w:val="none"/>
+        </w:rPr>
+      </w:r>
+      <w:r>
+        <w:rPr>
+          <w:rFonts w:ascii="Times New Roman" w:hAnsi="Times New Roman" w:eastAsia="Times New Roman" w:cs="Times New Roman"/>
+          <w:color w:val="000000"/>
+          <w:sz w:val="24"/>
+          <w:highlight w:val="none"/>
+        </w:rPr>
+      </w:r>
+      <w:r>
+        <w:rPr>
+          <w:rFonts w:ascii="Times New Roman" w:hAnsi="Times New Roman" w:eastAsia="Times New Roman" w:cs="Times New Roman"/>
+          <w:color w:val="000000"/>
+          <w:sz w:val="24"/>
+          <w:highlight w:val="none"/>
+        </w:rPr>
+      </w:r>
     </w:p>
     <w:p>
       <w:pPr>
@@ -1294,7 +2145,13 @@
       <w:pPr>
         <w:spacing/>
         <w:ind w:right="0" w:firstLine="0" w:left="0"/>
-        <w:rPr/>
+        <w:rPr>
+          <w:rFonts w:ascii="Times New Roman" w:hAnsi="Times New Roman" w:eastAsia="Times New Roman" w:cs="Times New Roman"/>
+          <w:color w:val="000000"/>
+          <w:sz w:val="24"/>
+          <w:szCs w:val="24"/>
+          <w:highlight w:val="none"/>
+        </w:rPr>
       </w:pPr>
       <w:r>
         <w:rPr>
@@ -1400,7 +2257,124 @@
         </w:rPr>
         <w:t xml:space="preserve"> pentru afișarea rezultatelor în ordine.</w:t>
       </w:r>
-      <w:r/>
+      <w:r>
+        <w:rPr>
+          <w:rFonts w:ascii="Times New Roman" w:hAnsi="Times New Roman" w:eastAsia="Times New Roman" w:cs="Times New Roman"/>
+          <w:sz w:val="24"/>
+        </w:rPr>
+      </w:r>
+    </w:p>
+    <w:p>
+      <w:pPr>
+        <w:spacing/>
+        <w:ind w:right="0" w:firstLine="0" w:left="0"/>
+        <w:rPr>
+          <w:rFonts w:ascii="Times New Roman" w:hAnsi="Times New Roman" w:eastAsia="Times New Roman" w:cs="Times New Roman"/>
+          <w:sz w:val="24"/>
+          <w:szCs w:val="24"/>
+        </w:rPr>
+      </w:pPr>
+      <w:r>
+        <w:rPr>
+          <w:rFonts w:ascii="Times New Roman" w:hAnsi="Times New Roman" w:eastAsia="Times New Roman" w:cs="Times New Roman"/>
+          <w:color w:val="000000"/>
+          <w:sz w:val="24"/>
+          <w:highlight w:val="none"/>
+        </w:rPr>
+      </w:r>
+      <w:r>
+        <mc:AlternateContent>
+          <mc:Choice Requires="wpg">
+            <w:drawing>
+              <wp:inline xmlns:wp="http://schemas.openxmlformats.org/drawingml/2006/wordprocessingDrawing" distT="0" distB="0" distL="0" distR="0">
+                <wp:extent cx="5943600" cy="1090914"/>
+                <wp:effectExtent l="0" t="0" r="0" b="0"/>
+                <wp:docPr id="8" name=""/>
+                <wp:cNvGraphicFramePr>
+                  <a:graphicFrameLocks xmlns:a="http://schemas.openxmlformats.org/drawingml/2006/main" noChangeAspect="1"/>
+                </wp:cNvGraphicFramePr>
+                <a:graphic xmlns:a="http://schemas.openxmlformats.org/drawingml/2006/main">
+                  <a:graphicData uri="http://schemas.openxmlformats.org/drawingml/2006/picture">
+                    <pic:pic xmlns:pic="http://schemas.openxmlformats.org/drawingml/2006/picture">
+                      <pic:nvPicPr>
+                        <pic:cNvPr id="1755920473" name=""/>
+                        <pic:cNvPicPr>
+                          <a:picLocks noChangeAspect="1"/>
+                        </pic:cNvPicPr>
+                        <pic:nvPr/>
+                      </pic:nvPicPr>
+                      <pic:blipFill rotWithShape="1">
+                        <a:blip r:embed="rId15"/>
+                        <a:stretch/>
+                      </pic:blipFill>
+                      <pic:spPr bwMode="auto">
+                        <a:xfrm>
+                          <a:off x="0" y="0"/>
+                          <a:ext cx="5943599" cy="1090913"/>
+                        </a:xfrm>
+                        <a:prstGeom prst="rect">
+                          <a:avLst/>
+                        </a:prstGeom>
+                      </pic:spPr>
+                    </pic:pic>
+                  </a:graphicData>
+                </a:graphic>
+              </wp:inline>
+            </w:drawing>
+          </mc:Choice>
+          <mc:Fallback>
+            <w:pict>
+              <v:shapetype id="_x0000_t75" coordsize="21600,21600" o:spt="75" o:preferrelative="t" path="m@4@5l@4@11@9@11@9@5xe" filled="f" stroked="f">
+                <v:stroke joinstyle="miter"/>
+                <v:formulas>
+                  <v:f eqn="if lineDrawn pixelLineWidth 0"/>
+                  <v:f eqn="sum @0 1 0"/>
+                  <v:f eqn="sum 0 0 @1"/>
+                  <v:f eqn="prod @2 1 2"/>
+                  <v:f eqn="prod @3 21600 pixelWidth"/>
+                  <v:f eqn="prod @3 21600 pixelHeight"/>
+                  <v:f eqn="sum @0 0 1"/>
+                  <v:f eqn="prod @6 1 2"/>
+                  <v:f eqn="prod @7 21600 pixelWidth"/>
+                  <v:f eqn="sum @8 21600 0"/>
+                  <v:f eqn="prod @7 21600 pixelHeight"/>
+                  <v:f eqn="sum @10 21600 0"/>
+                </v:formulas>
+                <v:path o:extrusionok="f" gradientshapeok="t" o:connecttype="rect"/>
+                <o:lock v:ext="edit" aspectratio="t"/>
+              </v:shapetype>
+              <v:shape id="_x0000_i7" o:spid="_x0000_s7" type="#_x0000_t75" style="width:468.00pt;height:85.90pt;mso-wrap-distance-left:0.00pt;mso-wrap-distance-top:0.00pt;mso-wrap-distance-right:0.00pt;mso-wrap-distance-bottom:0.00pt;z-index:1;" stroked="false">
+                <v:imagedata r:id="rId15" o:title=""/>
+                <o:lock v:ext="edit" rotation="t"/>
+              </v:shape>
+            </w:pict>
+          </mc:Fallback>
+        </mc:AlternateContent>
+      </w:r>
+      <w:r>
+        <w:rPr>
+          <w:rFonts w:ascii="Times New Roman" w:hAnsi="Times New Roman" w:eastAsia="Times New Roman" w:cs="Times New Roman"/>
+          <w:color w:val="000000"/>
+          <w:sz w:val="24"/>
+          <w:highlight w:val="none"/>
+        </w:rPr>
+      </w:r>
+      <w:r>
+        <w:rPr>
+          <w:rFonts w:ascii="Times New Roman" w:hAnsi="Times New Roman" w:eastAsia="Times New Roman" w:cs="Times New Roman"/>
+          <w:color w:val="000000"/>
+          <w:sz w:val="24"/>
+          <w:highlight w:val="none"/>
+        </w:rPr>
+      </w:r>
+      <w:r>
+        <w:rPr>
+          <w:rFonts w:ascii="Times New Roman" w:hAnsi="Times New Roman" w:eastAsia="Times New Roman" w:cs="Times New Roman"/>
+          <w:color w:val="000000"/>
+          <w:sz w:val="24"/>
+          <w:highlight w:val="none"/>
+        </w:rPr>
+      </w:r>
     </w:p>
     <w:p>
       <w:pPr>
@@ -1424,7 +2398,13 @@
       <w:pPr>
         <w:spacing/>
         <w:ind w:right="0" w:firstLine="0" w:left="0"/>
-        <w:rPr/>
+        <w:rPr>
+          <w:rFonts w:ascii="Times New Roman" w:hAnsi="Times New Roman" w:eastAsia="Times New Roman" w:cs="Times New Roman"/>
+          <w:color w:val="000000"/>
+          <w:sz w:val="24"/>
+          <w:szCs w:val="24"/>
+          <w:highlight w:val="none"/>
+        </w:rPr>
       </w:pPr>
       <w:r>
         <w:rPr>
@@ -1468,7 +2448,124 @@
         </w:rPr>
         <w:t xml:space="preserve">, am filtrat doar fișierele considerate periculoase. În rezultat, toate cele 4 fișiere SUID noi au fost clasificate cu risc mare.</w:t>
       </w:r>
-      <w:r/>
+      <w:r>
+        <w:rPr>
+          <w:rFonts w:ascii="Times New Roman" w:hAnsi="Times New Roman" w:eastAsia="Times New Roman" w:cs="Times New Roman"/>
+          <w:sz w:val="24"/>
+        </w:rPr>
+      </w:r>
+    </w:p>
+    <w:p>
+      <w:pPr>
+        <w:spacing/>
+        <w:ind w:right="0" w:firstLine="0" w:left="0"/>
+        <w:rPr>
+          <w:rFonts w:ascii="Times New Roman" w:hAnsi="Times New Roman" w:eastAsia="Times New Roman" w:cs="Times New Roman"/>
+          <w:sz w:val="24"/>
+          <w:szCs w:val="24"/>
+        </w:rPr>
+      </w:pPr>
+      <w:r>
+        <w:rPr>
+          <w:rFonts w:ascii="Times New Roman" w:hAnsi="Times New Roman" w:eastAsia="Times New Roman" w:cs="Times New Roman"/>
+          <w:color w:val="000000"/>
+          <w:sz w:val="24"/>
+          <w:highlight w:val="none"/>
+        </w:rPr>
+      </w:r>
+      <w:r>
+        <mc:AlternateContent>
+          <mc:Choice Requires="wpg">
+            <w:drawing>
+              <wp:inline xmlns:wp="http://schemas.openxmlformats.org/drawingml/2006/wordprocessingDrawing" distT="0" distB="0" distL="0" distR="0">
+                <wp:extent cx="5943600" cy="1090914"/>
+                <wp:effectExtent l="0" t="0" r="0" b="0"/>
+                <wp:docPr id="9" name=""/>
+                <wp:cNvGraphicFramePr>
+                  <a:graphicFrameLocks xmlns:a="http://schemas.openxmlformats.org/drawingml/2006/main" noChangeAspect="1"/>
+                </wp:cNvGraphicFramePr>
+                <a:graphic xmlns:a="http://schemas.openxmlformats.org/drawingml/2006/main">
+                  <a:graphicData uri="http://schemas.openxmlformats.org/drawingml/2006/picture">
+                    <pic:pic xmlns:pic="http://schemas.openxmlformats.org/drawingml/2006/picture">
+                      <pic:nvPicPr>
+                        <pic:cNvPr id="1601431859" name=""/>
+                        <pic:cNvPicPr>
+                          <a:picLocks noChangeAspect="1"/>
+                        </pic:cNvPicPr>
+                        <pic:nvPr/>
+                      </pic:nvPicPr>
+                      <pic:blipFill rotWithShape="1">
+                        <a:blip r:embed="rId16"/>
+                        <a:stretch/>
+                      </pic:blipFill>
+                      <pic:spPr bwMode="auto">
+                        <a:xfrm>
+                          <a:off x="0" y="0"/>
+                          <a:ext cx="5943599" cy="1090913"/>
+                        </a:xfrm>
+                        <a:prstGeom prst="rect">
+                          <a:avLst/>
+                        </a:prstGeom>
+                      </pic:spPr>
+                    </pic:pic>
+                  </a:graphicData>
+                </a:graphic>
+              </wp:inline>
+            </w:drawing>
+          </mc:Choice>
+          <mc:Fallback>
+            <w:pict>
+              <v:shapetype id="_x0000_t75" coordsize="21600,21600" o:spt="75" o:preferrelative="t" path="m@4@5l@4@11@9@11@9@5xe" filled="f" stroked="f">
+                <v:stroke joinstyle="miter"/>
+                <v:formulas>
+                  <v:f eqn="if lineDrawn pixelLineWidth 0"/>
+                  <v:f eqn="sum @0 1 0"/>
+                  <v:f eqn="sum 0 0 @1"/>
+                  <v:f eqn="prod @2 1 2"/>
+                  <v:f eqn="prod @3 21600 pixelWidth"/>
+                  <v:f eqn="prod @3 21600 pixelHeight"/>
+                  <v:f eqn="sum @0 0 1"/>
+                  <v:f eqn="prod @6 1 2"/>
+                  <v:f eqn="prod @7 21600 pixelWidth"/>
+                  <v:f eqn="sum @8 21600 0"/>
+                  <v:f eqn="prod @7 21600 pixelHeight"/>
+                  <v:f eqn="sum @10 21600 0"/>
+                </v:formulas>
+                <v:path o:extrusionok="f" gradientshapeok="t" o:connecttype="rect"/>
+                <o:lock v:ext="edit" aspectratio="t"/>
+              </v:shapetype>
+              <v:shape id="_x0000_i8" o:spid="_x0000_s8" type="#_x0000_t75" style="width:468.00pt;height:85.90pt;mso-wrap-distance-left:0.00pt;mso-wrap-distance-top:0.00pt;mso-wrap-distance-right:0.00pt;mso-wrap-distance-bottom:0.00pt;z-index:1;" stroked="false">
+                <v:imagedata r:id="rId16" o:title=""/>
+                <o:lock v:ext="edit" rotation="t"/>
+              </v:shape>
+            </w:pict>
+          </mc:Fallback>
+        </mc:AlternateContent>
+      </w:r>
+      <w:r>
+        <w:rPr>
+          <w:rFonts w:ascii="Times New Roman" w:hAnsi="Times New Roman" w:eastAsia="Times New Roman" w:cs="Times New Roman"/>
+          <w:color w:val="000000"/>
+          <w:sz w:val="24"/>
+          <w:highlight w:val="none"/>
+        </w:rPr>
+      </w:r>
+      <w:r>
+        <w:rPr>
+          <w:rFonts w:ascii="Times New Roman" w:hAnsi="Times New Roman" w:eastAsia="Times New Roman" w:cs="Times New Roman"/>
+          <w:color w:val="000000"/>
+          <w:sz w:val="24"/>
+          <w:highlight w:val="none"/>
+        </w:rPr>
+      </w:r>
+      <w:r>
+        <w:rPr>
+          <w:rFonts w:ascii="Times New Roman" w:hAnsi="Times New Roman" w:eastAsia="Times New Roman" w:cs="Times New Roman"/>
+          <w:color w:val="000000"/>
+          <w:sz w:val="24"/>
+          <w:highlight w:val="none"/>
+        </w:rPr>
+      </w:r>
     </w:p>
     <w:p>
       <w:pPr>
@@ -1492,7 +2589,13 @@
       <w:pPr>
         <w:spacing/>
         <w:ind w:right="0" w:firstLine="0" w:left="0"/>
-        <w:rPr/>
+        <w:rPr>
+          <w:rFonts w:ascii="Times New Roman" w:hAnsi="Times New Roman" w:eastAsia="Times New Roman" w:cs="Times New Roman"/>
+          <w:color w:val="000000"/>
+          <w:sz w:val="24"/>
+          <w:szCs w:val="24"/>
+          <w:highlight w:val="none"/>
+        </w:rPr>
       </w:pPr>
       <w:r>
         <w:rPr>
@@ -1550,7 +2653,224 @@
         </w:rPr>
         <w:t xml:space="preserve">, care permite verificarea automată a funcționalității codului.</w:t>
       </w:r>
-      <w:r/>
+      <w:r>
+        <w:rPr>
+          <w:rFonts w:ascii="Times New Roman" w:hAnsi="Times New Roman" w:eastAsia="Times New Roman" w:cs="Times New Roman"/>
+          <w:sz w:val="24"/>
+        </w:rPr>
+      </w:r>
+    </w:p>
+    <w:p>
+      <w:pPr>
+        <w:spacing/>
+        <w:ind w:right="0" w:firstLine="0" w:left="0"/>
+        <w:rPr>
+          <w:rFonts w:ascii="Times New Roman" w:hAnsi="Times New Roman" w:eastAsia="Times New Roman" w:cs="Times New Roman"/>
+          <w:color w:val="000000"/>
+          <w:sz w:val="24"/>
+          <w:szCs w:val="24"/>
+          <w:highlight w:val="none"/>
+        </w:rPr>
+      </w:pPr>
+      <w:r>
+        <w:rPr>
+          <w:rFonts w:ascii="Times New Roman" w:hAnsi="Times New Roman" w:eastAsia="Times New Roman" w:cs="Times New Roman"/>
+          <w:color w:val="000000"/>
+          <w:sz w:val="24"/>
+          <w:highlight w:val="none"/>
+        </w:rPr>
+      </w:r>
+      <w:r>
+        <mc:AlternateContent>
+          <mc:Choice Requires="wpg">
+            <w:drawing>
+              <wp:inline xmlns:wp="http://schemas.openxmlformats.org/drawingml/2006/wordprocessingDrawing" distT="0" distB="0" distL="0" distR="0">
+                <wp:extent cx="5943600" cy="1090914"/>
+                <wp:effectExtent l="0" t="0" r="0" b="0"/>
+                <wp:docPr id="10" name=""/>
+                <wp:cNvGraphicFramePr>
+                  <a:graphicFrameLocks xmlns:a="http://schemas.openxmlformats.org/drawingml/2006/main" noChangeAspect="1"/>
+                </wp:cNvGraphicFramePr>
+                <a:graphic xmlns:a="http://schemas.openxmlformats.org/drawingml/2006/main">
+                  <a:graphicData uri="http://schemas.openxmlformats.org/drawingml/2006/picture">
+                    <pic:pic xmlns:pic="http://schemas.openxmlformats.org/drawingml/2006/picture">
+                      <pic:nvPicPr>
+                        <pic:cNvPr id="280923585" name=""/>
+                        <pic:cNvPicPr>
+                          <a:picLocks noChangeAspect="1"/>
+                        </pic:cNvPicPr>
+                        <pic:nvPr/>
+                      </pic:nvPicPr>
+                      <pic:blipFill rotWithShape="1">
+                        <a:blip r:embed="rId17"/>
+                        <a:stretch/>
+                      </pic:blipFill>
+                      <pic:spPr bwMode="auto">
+                        <a:xfrm>
+                          <a:off x="0" y="0"/>
+                          <a:ext cx="5943599" cy="1090913"/>
+                        </a:xfrm>
+                        <a:prstGeom prst="rect">
+                          <a:avLst/>
+                        </a:prstGeom>
+                      </pic:spPr>
+                    </pic:pic>
+                  </a:graphicData>
+                </a:graphic>
+              </wp:inline>
+            </w:drawing>
+          </mc:Choice>
+          <mc:Fallback>
+            <w:pict>
+              <v:shapetype id="_x0000_t75" coordsize="21600,21600" o:spt="75" o:preferrelative="t" path="m@4@5l@4@11@9@11@9@5xe" filled="f" stroked="f">
+                <v:stroke joinstyle="miter"/>
+                <v:formulas>
+                  <v:f eqn="if lineDrawn pixelLineWidth 0"/>
+                  <v:f eqn="sum @0 1 0"/>
+                  <v:f eqn="sum 0 0 @1"/>
+                  <v:f eqn="prod @2 1 2"/>
+                  <v:f eqn="prod @3 21600 pixelWidth"/>
+                  <v:f eqn="prod @3 21600 pixelHeight"/>
+                  <v:f eqn="sum @0 0 1"/>
+                  <v:f eqn="prod @6 1 2"/>
+                  <v:f eqn="prod @7 21600 pixelWidth"/>
+                  <v:f eqn="sum @8 21600 0"/>
+                  <v:f eqn="prod @7 21600 pixelHeight"/>
+                  <v:f eqn="sum @10 21600 0"/>
+                </v:formulas>
+                <v:path o:extrusionok="f" gradientshapeok="t" o:connecttype="rect"/>
+                <o:lock v:ext="edit" aspectratio="t"/>
+              </v:shapetype>
+              <v:shape id="_x0000_i9" o:spid="_x0000_s9" type="#_x0000_t75" style="width:468.00pt;height:85.90pt;mso-wrap-distance-left:0.00pt;mso-wrap-distance-top:0.00pt;mso-wrap-distance-right:0.00pt;mso-wrap-distance-bottom:0.00pt;z-index:1;" stroked="false">
+                <v:imagedata r:id="rId17" o:title=""/>
+                <o:lock v:ext="edit" rotation="t"/>
+              </v:shape>
+            </w:pict>
+          </mc:Fallback>
+        </mc:AlternateContent>
+      </w:r>
+      <w:r>
+        <w:rPr>
+          <w:rFonts w:ascii="Times New Roman" w:hAnsi="Times New Roman" w:eastAsia="Times New Roman" w:cs="Times New Roman"/>
+          <w:color w:val="000000"/>
+          <w:sz w:val="24"/>
+          <w:highlight w:val="none"/>
+        </w:rPr>
+      </w:r>
+      <w:r>
+        <w:rPr>
+          <w:rFonts w:ascii="Times New Roman" w:hAnsi="Times New Roman" w:eastAsia="Times New Roman" w:cs="Times New Roman"/>
+          <w:color w:val="000000"/>
+          <w:sz w:val="24"/>
+          <w:highlight w:val="none"/>
+        </w:rPr>
+      </w:r>
+      <w:r>
+        <w:rPr>
+          <w:rFonts w:ascii="Times New Roman" w:hAnsi="Times New Roman" w:eastAsia="Times New Roman" w:cs="Times New Roman"/>
+          <w:sz w:val="24"/>
+          <w:szCs w:val="24"/>
+        </w:rPr>
+      </w:r>
+    </w:p>
+    <w:p>
+      <w:pPr>
+        <w:spacing/>
+        <w:ind w:right="0" w:firstLine="0" w:left="0"/>
+        <w:rPr>
+          <w:rFonts w:ascii="Times New Roman" w:hAnsi="Times New Roman" w:eastAsia="Times New Roman" w:cs="Times New Roman"/>
+          <w:sz w:val="24"/>
+          <w:szCs w:val="24"/>
+        </w:rPr>
+      </w:pPr>
+      <w:r>
+        <w:rPr>
+          <w:rFonts w:ascii="Times New Roman" w:hAnsi="Times New Roman" w:eastAsia="Times New Roman" w:cs="Times New Roman"/>
+          <w:sz w:val="24"/>
+          <w:szCs w:val="24"/>
+        </w:rPr>
+      </w:r>
+      <w:r>
+        <w:rPr>
+          <w:rFonts w:ascii="Times New Roman" w:hAnsi="Times New Roman" w:eastAsia="Times New Roman" w:cs="Times New Roman"/>
+          <w:sz w:val="24"/>
+          <w:szCs w:val="24"/>
+        </w:rPr>
+      </w:r>
+      <w:r>
+        <w:rPr>
+          <w:rFonts w:ascii="Times New Roman" w:hAnsi="Times New Roman" w:eastAsia="Times New Roman" w:cs="Times New Roman"/>
+          <w:sz w:val="24"/>
+          <w:szCs w:val="24"/>
+        </w:rPr>
+      </w:r>
+    </w:p>
+    <w:p>
+      <w:pPr>
+        <w:spacing/>
+        <w:ind w:right="0" w:firstLine="0" w:left="0"/>
+        <w:rPr>
+          <w:rFonts w:ascii="Times New Roman" w:hAnsi="Times New Roman" w:eastAsia="Times New Roman" w:cs="Times New Roman"/>
+          <w:sz w:val="24"/>
+          <w:szCs w:val="24"/>
+        </w:rPr>
+      </w:pPr>
+      <w:r>
+        <w:rPr>
+          <w:rFonts w:ascii="Times New Roman" w:hAnsi="Times New Roman" w:eastAsia="Times New Roman" w:cs="Times New Roman"/>
+          <w:sz w:val="24"/>
+          <w:szCs w:val="24"/>
+        </w:rPr>
+      </w:r>
+      <w:r>
+        <w:rPr>
+          <w:rFonts w:ascii="Times New Roman" w:hAnsi="Times New Roman" w:eastAsia="Times New Roman" w:cs="Times New Roman"/>
+          <w:sz w:val="24"/>
+          <w:szCs w:val="24"/>
+        </w:rPr>
+      </w:r>
+      <w:r>
+        <w:rPr>
+          <w:rFonts w:ascii="Times New Roman" w:hAnsi="Times New Roman" w:eastAsia="Times New Roman" w:cs="Times New Roman"/>
+          <w:sz w:val="24"/>
+          <w:szCs w:val="24"/>
+        </w:rPr>
+      </w:r>
+    </w:p>
+    <w:p>
+      <w:pPr>
+        <w:spacing/>
+        <w:ind w:right="0" w:firstLine="0" w:left="0"/>
+        <w:rPr>
+          <w:rFonts w:ascii="Times New Roman" w:hAnsi="Times New Roman" w:eastAsia="Times New Roman" w:cs="Times New Roman"/>
+          <w:sz w:val="24"/>
+          <w:szCs w:val="24"/>
+        </w:rPr>
+      </w:pPr>
+      <w:r>
+        <w:rPr>
+          <w:rFonts w:ascii="Times New Roman" w:hAnsi="Times New Roman" w:eastAsia="Times New Roman" w:cs="Times New Roman"/>
+          <w:color w:val="000000"/>
+          <w:sz w:val="24"/>
+          <w:highlight w:val="none"/>
+        </w:rPr>
+      </w:r>
+      <w:r>
+        <w:rPr>
+          <w:rFonts w:ascii="Times New Roman" w:hAnsi="Times New Roman" w:eastAsia="Times New Roman" w:cs="Times New Roman"/>
+          <w:color w:val="000000"/>
+          <w:sz w:val="24"/>
+          <w:highlight w:val="none"/>
+        </w:rPr>
+      </w:r>
+      <w:r>
+        <w:rPr>
+          <w:rFonts w:ascii="Times New Roman" w:hAnsi="Times New Roman" w:eastAsia="Times New Roman" w:cs="Times New Roman"/>
+          <w:color w:val="000000"/>
+          <w:sz w:val="24"/>
+          <w:highlight w:val="none"/>
+        </w:rPr>
+      </w:r>
     </w:p>
     <w:p>
       <w:pPr>

</xml_diff>